<commit_message>
Finalize time fields and synopsis alignment
</commit_message>
<xml_diff>
--- a/FindIt_Project_Synopsis.docx
+++ b/FindIt_Project_Synopsis.docx
@@ -1182,7 +1182,7 @@
         <w:jc w:val="both"/>
       </w:pPr>
       <w:r>
-        <w:t>Students frequently lose items such as identity cards, keys, books, calculators, wallets, earphones, and other personal belongings on a college campus. The information about these items is commonly shared through informal messages, notice boards, or personal conversations. These methods do not provide a searchable record, consistent details, or a reliable way to connect a lost report with a found report. FindIt is proposed as a software platform to organise this process in one place.</w:t>
+        <w:t>Students frequently lose items such as identity cards, keys, books, calculators, wallets, earphones, and other personal belongings on a college campus. Information about these items is often shared through informal messages, notice boards, or personal conversations. These methods do not provide a searchable record, consistent details, or a reliable way to connect a lost report with a found report. FindIt organises this process in one browser-based platform.</w:t>
       </w:r>
     </w:p>
     <w:p>
@@ -1199,7 +1199,7 @@
         <w:jc w:val="both"/>
       </w:pPr>
       <w:r>
-        <w:t>A person who loses an item may not know where to report it or how to search all available found-item information. Descriptions can also use different words for the same object, making exact keyword search ineffective. A structured system should store item descriptions, category, location, date, colour, and status, while also suggesting likely matches. It should provide basic verification before an item is marked as returned.</w:t>
+        <w:t>A person who loses an item may not know where to report it or how to search all available found-item information. Descriptions can also use different words for the same object, making exact keyword search ineffective. FindIt addresses this problem by storing the item description, category, date, approximate time, location, colour, contact details, and status in a structured report.</w:t>
       </w:r>
     </w:p>
     <w:p>
@@ -1216,7 +1216,7 @@
         <w:jc w:val="both"/>
       </w:pPr>
       <w:r>
-        <w:t>FindIt will be a responsive web application for students and staff. A user can submit a lost-item or found-item report, attach an image if available, search reports using filters, and view possible matches. The matching module will compare category, keywords, colour, location, and time. Text similarity using TF-IDF and cosine similarity can be used as an optional machine-learning component, while a weighted scoring algorithm will ensure that the system remains understandable and easy to test.</w:t>
+        <w:t>FindIt is a responsive web application for students and staff. A user can submit a lost-item or found-item report, search reports using a keyword search and dropdown filters, and view possible matches. The matching module compares category, colour, location, date, and description tokens. A transparent weighted score ranks the results, while a small synonym-normalisation step helps relate words such as earbuds and earphones. Records are stored in the browser using localStorage, so the current version is suitable for a local demonstration and does not require a server.</w:t>
       </w:r>
     </w:p>
     <w:p>
@@ -1305,7 +1305,7 @@
         <w:jc w:val="both"/>
       </w:pPr>
       <w:r>
-        <w:t>The initial system will support student or staff reporting, search, matching, status updates, and basic administrator review. It will not provide payment, public social networking, real-time GPS tracking, or guaranteed identity verification. Contact details can be protected from general users and shown only when a coordinator approves a possible match. The system can later be extended with authentication, notifications, image-based similarity, and a mobile application.</w:t>
+        <w:t>The current system supports student or staff reporting, keyword search, dropdown filtering, matching, status updates, and a coordinator review view. It does not provide a shared online database, user authentication, email notifications, payment, public social networking, real-time GPS tracking, image upload, or guaranteed identity verification. Since the current version uses browser localStorage, records remain on the device and are not automatically shared across devices. These features can be considered in a future server-backed or mobile version.</w:t>
       </w:r>
     </w:p>
     <w:p>
@@ -1322,7 +1322,7 @@
         <w:jc w:val="both"/>
       </w:pPr>
       <w:r>
-        <w:t>The proposed stack consists of HTML, CSS, JavaScript, Python Flask, and SQLite. The backend will expose routes for reports, searches, matches, and status changes. Data structures such as hash maps, sets, lists, and priority queues can support indexing and ranking. The optional NLP module will use tokenisation, TF-IDF vectorisation, and cosine similarity.</w:t>
+        <w:t>The final project uses HTML5 for structure, CSS3 for responsive presentation, and vanilla JavaScript for validation, navigation, localStorage data management, searching, filtering, status changes, and matching. The implementation uses arrays, objects, sets, loops, and string-token processing rather than a separate backend or external library. The matching score gives fixed weights to category, colour, location, date, and description similarity, making every suggestion explainable and easy to test.</w:t>
       </w:r>
     </w:p>
     <w:tbl>
@@ -1361,17 +1361,7 @@
             </w:tcMar>
           </w:tcPr>
           <w:p>
-            <w:pPr>
-              <w:spacing w:after="0"/>
-              <w:jc w:val="center"/>
-            </w:pPr>
             <w:r>
-              <w:rPr>
-                <w:rFonts w:ascii="Times New Roman" w:hAnsi="Times New Roman"/>
-                <w:b/>
-                <w:color w:val="FFFFFF"/>
-                <w:sz w:val="20"/>
-              </w:rPr>
               <w:t>Technical Term</w:t>
             </w:r>
           </w:p>
@@ -1389,17 +1379,7 @@
             </w:tcMar>
           </w:tcPr>
           <w:p>
-            <w:pPr>
-              <w:spacing w:after="0"/>
-              <w:jc w:val="center"/>
-            </w:pPr>
             <w:r>
-              <w:rPr>
-                <w:rFonts w:ascii="Times New Roman" w:hAnsi="Times New Roman"/>
-                <w:b/>
-                <w:color w:val="FFFFFF"/>
-                <w:sz w:val="20"/>
-              </w:rPr>
               <w:t>Meaning in the Proposed Project</w:t>
             </w:r>
           </w:p>
@@ -1419,15 +1399,7 @@
             </w:tcMar>
           </w:tcPr>
           <w:p>
-            <w:pPr>
-              <w:spacing w:after="0"/>
-            </w:pPr>
             <w:r>
-              <w:rPr>
-                <w:rFonts w:ascii="Times New Roman" w:hAnsi="Times New Roman"/>
-                <w:b/>
-                <w:sz w:val="20"/>
-              </w:rPr>
               <w:t>Lost Report</w:t>
             </w:r>
           </w:p>
@@ -1444,14 +1416,7 @@
             </w:tcMar>
           </w:tcPr>
           <w:p>
-            <w:pPr>
-              <w:spacing w:after="0"/>
-            </w:pPr>
             <w:r>
-              <w:rPr>
-                <w:rFonts w:ascii="Times New Roman" w:hAnsi="Times New Roman"/>
-                <w:sz w:val="20"/>
-              </w:rPr>
               <w:t>A record created by a person who is searching for an item.</w:t>
             </w:r>
           </w:p>
@@ -1471,15 +1436,7 @@
             </w:tcMar>
           </w:tcPr>
           <w:p>
-            <w:pPr>
-              <w:spacing w:after="0"/>
-            </w:pPr>
             <w:r>
-              <w:rPr>
-                <w:rFonts w:ascii="Times New Roman" w:hAnsi="Times New Roman"/>
-                <w:b/>
-                <w:sz w:val="20"/>
-              </w:rPr>
               <w:t>Found Report</w:t>
             </w:r>
           </w:p>
@@ -1496,14 +1453,7 @@
             </w:tcMar>
           </w:tcPr>
           <w:p>
-            <w:pPr>
-              <w:spacing w:after="0"/>
-            </w:pPr>
             <w:r>
-              <w:rPr>
-                <w:rFonts w:ascii="Times New Roman" w:hAnsi="Times New Roman"/>
-                <w:sz w:val="20"/>
-              </w:rPr>
               <w:t>A record created by a person who has recovered an item.</w:t>
             </w:r>
           </w:p>
@@ -1523,16 +1473,8 @@
             </w:tcMar>
           </w:tcPr>
           <w:p>
-            <w:pPr>
-              <w:spacing w:after="0"/>
-            </w:pPr>
             <w:r>
-              <w:rPr>
-                <w:rFonts w:ascii="Times New Roman" w:hAnsi="Times New Roman"/>
-                <w:b/>
-                <w:sz w:val="20"/>
-              </w:rPr>
-              <w:t>TF-IDF</w:t>
+              <w:t>Match Score</w:t>
             </w:r>
           </w:p>
         </w:tc>
@@ -1548,15 +1490,8 @@
             </w:tcMar>
           </w:tcPr>
           <w:p>
-            <w:pPr>
-              <w:spacing w:after="0"/>
-            </w:pPr>
             <w:r>
-              <w:rPr>
-                <w:rFonts w:ascii="Times New Roman" w:hAnsi="Times New Roman"/>
-                <w:sz w:val="20"/>
-              </w:rPr>
-              <w:t>A text representation that gives higher importance to informative words.</w:t>
+              <w:t>A transparent weighted value used to rank a lost report against a found report.</w:t>
             </w:r>
           </w:p>
         </w:tc>
@@ -1575,16 +1510,8 @@
             </w:tcMar>
           </w:tcPr>
           <w:p>
-            <w:pPr>
-              <w:spacing w:after="0"/>
-            </w:pPr>
             <w:r>
-              <w:rPr>
-                <w:rFonts w:ascii="Times New Roman" w:hAnsi="Times New Roman"/>
-                <w:b/>
-                <w:sz w:val="20"/>
-              </w:rPr>
-              <w:t>Cosine Similarity</w:t>
+              <w:t>Normalised Token Similarity</w:t>
             </w:r>
           </w:p>
         </w:tc>
@@ -1600,15 +1527,8 @@
             </w:tcMar>
           </w:tcPr>
           <w:p>
-            <w:pPr>
-              <w:spacing w:after="0"/>
-            </w:pPr>
             <w:r>
-              <w:rPr>
-                <w:rFonts w:ascii="Times New Roman" w:hAnsi="Times New Roman"/>
-                <w:sz w:val="20"/>
-              </w:rPr>
-              <w:t>A score that estimates how similar two text descriptions are.</w:t>
+              <w:t>A small text comparison method that standardises related words before comparing descriptions.</w:t>
             </w:r>
           </w:p>
         </w:tc>
@@ -1627,16 +1547,8 @@
             </w:tcMar>
           </w:tcPr>
           <w:p>
-            <w:pPr>
-              <w:spacing w:after="0"/>
-            </w:pPr>
             <w:r>
-              <w:rPr>
-                <w:rFonts w:ascii="Times New Roman" w:hAnsi="Times New Roman"/>
-                <w:b/>
-                <w:sz w:val="20"/>
-              </w:rPr>
-              <w:t>Match Score</w:t>
+              <w:t>Search Filter</w:t>
             </w:r>
           </w:p>
         </w:tc>
@@ -1652,15 +1564,8 @@
             </w:tcMar>
           </w:tcPr>
           <w:p>
-            <w:pPr>
-              <w:spacing w:after="0"/>
-            </w:pPr>
             <w:r>
-              <w:rPr>
-                <w:rFonts w:ascii="Times New Roman" w:hAnsi="Times New Roman"/>
-                <w:sz w:val="20"/>
-              </w:rPr>
-              <w:t>A weighted value based on category, keywords, location, date, and colour.</w:t>
+              <w:t>A control used to narrow reports by type, category, or status while keyword search covers item details.</w:t>
             </w:r>
           </w:p>
         </w:tc>
@@ -1679,15 +1584,7 @@
             </w:tcMar>
           </w:tcPr>
           <w:p>
-            <w:pPr>
-              <w:spacing w:after="0"/>
-            </w:pPr>
             <w:r>
-              <w:rPr>
-                <w:rFonts w:ascii="Times New Roman" w:hAnsi="Times New Roman"/>
-                <w:b/>
-                <w:sz w:val="20"/>
-              </w:rPr>
               <w:t>Status</w:t>
             </w:r>
           </w:p>
@@ -1704,15 +1601,8 @@
             </w:tcMar>
           </w:tcPr>
           <w:p>
-            <w:pPr>
-              <w:spacing w:after="0"/>
-            </w:pPr>
             <w:r>
-              <w:rPr>
-                <w:rFonts w:ascii="Times New Roman" w:hAnsi="Times New Roman"/>
-                <w:sz w:val="20"/>
-              </w:rPr>
-              <w:t>The current stage of a report, such as Open, Claimed, or Returned.</w:t>
+              <w:t>The current stage of a report, such as Open, Possible Match, Claimed, or Returned.</w:t>
             </w:r>
           </w:p>
         </w:tc>
@@ -1737,7 +1627,7 @@
         <w:jc w:val="both"/>
       </w:pPr>
       <w:r>
-        <w:t>The completed application will allow a campus community to record, search, and manage lost-and-found information in a structured way. The matching feature will reduce manual searching and demonstrate how data structures, information retrieval, database operations, and a small machine-learning component can work together in a practical web application.</w:t>
+        <w:t>The completed application allows a campus community to record, search, filter, and manage lost-and-found information in a structured way. Its matching feature ranks likely lost-found pairs and displays the reasons behind each suggestion. The project demonstrates how web interfaces, browser storage, data structures, input validation, and a small information-retrieval technique can work together in a practical software application.</w:t>
       </w:r>
     </w:p>
     <w:p>
@@ -1754,7 +1644,7 @@
         <w:jc w:val="both"/>
       </w:pPr>
       <w:r>
-        <w:t>Information retrieval research describes methods for representing documents and ranking them against a query. TF-IDF is a standard approach for assigning importance to terms, and cosine similarity is commonly used to compare text vectors. These techniques are suitable for FindIt because item descriptions are short, the dataset is manageable, and the result can be explained to users instead of being treated as an unexplained prediction.</w:t>
+        <w:t>Information retrieval research describes methods for representing documents and ranking them against a query. Token normalisation and vector-style similarity are useful for short descriptions because they can identify shared meaning without requiring an opaque prediction model. FindIt applies this idea in a deliberately small and explainable form: common equivalent terms are normalised before the description similarity is calculated.</w:t>
       </w:r>
     </w:p>
     <w:p>
@@ -1762,7 +1652,7 @@
         <w:jc w:val="both"/>
       </w:pPr>
       <w:r>
-        <w:t>Existing lost-and-found solutions include notice boards, social-media groups, messaging channels, and general-purpose reporting forms. These approaches may reach many people but usually lack a structured database, consistent filters, report status, and automatic comparison between lost and found descriptions. They also make it difficult to search by combinations such as category, location, date, and colour.</w:t>
+        <w:t>Existing lost-and-found solutions include notice boards, social-media groups, messaging channels, and general-purpose reporting forms. These approaches may reach many people but usually lack a structured record, consistent filters, report status, and automatic comparison between lost and found descriptions. They also make it difficult to search by combinations such as category, location, date, colour, and time.</w:t>
       </w:r>
     </w:p>
     <w:p>
@@ -1770,7 +1660,7 @@
         <w:jc w:val="both"/>
       </w:pPr>
       <w:r>
-        <w:t>FindIt combines the strengths of a searchable database with a transparent matching layer. Exact attributes such as category and location can be handled through filtering, while text similarity can identify related descriptions such as 'black wireless earbuds' and 'black Bluetooth earphones'. A coordinator-controlled claim process is included to reduce the risk of an item being incorrectly marked as returned. The project therefore applies established web and information-retrieval techniques to a focused campus problem.</w:t>
+        <w:t>FindIt combines a searchable campus report board with a transparent matching layer. Exact attributes such as category, colour, location, and status can be searched or filtered, while normalised text similarity can relate descriptions such as black wireless earbuds and black Bluetooth earphones. A coordinator view supports review of reports, contact-detail access, and status changes from Open to Possible Match, Claimed, or Returned. The project therefore applies established web and information-retrieval ideas to a focused campus problem.</w:t>
       </w:r>
     </w:p>
     <w:p>
@@ -1787,7 +1677,7 @@
         <w:jc w:val="both"/>
       </w:pPr>
       <w:r>
-        <w:t>The project will be developed in small, testable stages so that the basic reporting and search features remain usable even if the optional matching module requires further refinement.</w:t>
+        <w:t>The project is developed in small, testable stages so that reporting and search remain usable while the matching logic is refined.</w:t>
       </w:r>
     </w:p>
     <w:p>
@@ -1796,7 +1686,7 @@
         <w:spacing w:after="60"/>
       </w:pPr>
       <w:r>
-        <w:t>Requirement analysis: identify user roles, report fields, privacy needs, search filters, and status transitions.</w:t>
+        <w:t>Requirement analysis: identify report fields, privacy needs, search filters, status transitions, and coordinator actions.</w:t>
       </w:r>
     </w:p>
     <w:p>
@@ -1805,7 +1695,7 @@
         <w:spacing w:after="60"/>
       </w:pPr>
       <w:r>
-        <w:t>Database design: create tables for users, lost reports, found reports, matches, and claim or verification records.</w:t>
+        <w:t>Client-side data design: define the report object, sample records, status values, and localStorage format.</w:t>
       </w:r>
     </w:p>
     <w:p>
@@ -1814,7 +1704,7 @@
         <w:spacing w:after="60"/>
       </w:pPr>
       <w:r>
-        <w:t>Core implementation: build report forms, validation, database operations, search, filtering, and status management.</w:t>
+        <w:t>Core implementation: build the report form, required-field validation, localStorage operations, search, filtering, and status management.</w:t>
       </w:r>
     </w:p>
     <w:p>
@@ -1823,7 +1713,7 @@
         <w:spacing w:after="60"/>
       </w:pPr>
       <w:r>
-        <w:t>Matching implementation: calculate a weighted score from structured attributes and add TF-IDF similarity for descriptions.</w:t>
+        <w:t>Matching implementation: calculate a weighted score from category, colour, location, date, and normalised description similarity, then show the reasons for each suggestion.</w:t>
       </w:r>
     </w:p>
     <w:p>
@@ -1832,7 +1722,7 @@
         <w:spacing w:after="60"/>
       </w:pPr>
       <w:r>
-        <w:t>Interface development: create responsive pages for reporting, browsing, report details, possible matches, and administrator review.</w:t>
+        <w:t>Interface development: create responsive dashboard, report form, report board, possible-match view, and coordinator review view using HTML, CSS, and JavaScript.</w:t>
       </w:r>
     </w:p>
     <w:p>
@@ -1841,7 +1731,7 @@
         <w:spacing w:after="60"/>
       </w:pPr>
       <w:r>
-        <w:t>Testing and evaluation: use sample campus cases, test duplicate and incomplete reports, inspect ranking quality, and document limitations.</w:t>
+        <w:t>Testing and evaluation: run JavaScript algorithm checks, test incomplete reports, publish a report in the browser, inspect search results, verify match ranking, and test coordinator status changes.</w:t>
       </w:r>
     </w:p>
     <w:p>
@@ -1849,7 +1739,7 @@
         <w:jc w:val="both"/>
       </w:pPr>
       <w:r>
-        <w:t>The matching output will be evaluated using manually prepared examples. The team will compare the top suggested matches with expected matches and adjust the weights for category, location, date, colour, and description similarity.</w:t>
+        <w:t>The matching output is evaluated with prepared campus examples. The team can compare the top suggested matches with expected matches and adjust the fixed weights for category, colour, location, date, and description similarity.</w:t>
       </w:r>
     </w:p>
     <w:p>
@@ -1866,7 +1756,7 @@
         <w:jc w:val="both"/>
       </w:pPr>
       <w:r>
-        <w:t>The project can be developed and tested using the following software and hardware facilities. No specialised hardware or sensors are required.</w:t>
+        <w:t>The project can be developed and tested using the following software and hardware facilities. No specialised hardware, sensor, server, Python installation, or internet connection is required for the application itself.</w:t>
       </w:r>
     </w:p>
     <w:tbl>
@@ -1902,17 +1792,7 @@
             </w:tcMar>
           </w:tcPr>
           <w:p>
-            <w:pPr>
-              <w:spacing w:after="0"/>
-              <w:jc w:val="center"/>
-            </w:pPr>
             <w:r>
-              <w:rPr>
-                <w:rFonts w:ascii="Times New Roman" w:hAnsi="Times New Roman"/>
-                <w:b/>
-                <w:color w:val="FFFFFF"/>
-                <w:sz w:val="20"/>
-              </w:rPr>
               <w:t>Category</w:t>
             </w:r>
           </w:p>
@@ -1930,17 +1810,7 @@
             </w:tcMar>
           </w:tcPr>
           <w:p>
-            <w:pPr>
-              <w:spacing w:after="0"/>
-              <w:jc w:val="center"/>
-            </w:pPr>
             <w:r>
-              <w:rPr>
-                <w:rFonts w:ascii="Times New Roman" w:hAnsi="Times New Roman"/>
-                <w:b/>
-                <w:color w:val="FFFFFF"/>
-                <w:sz w:val="20"/>
-              </w:rPr>
               <w:t>Requirements</w:t>
             </w:r>
           </w:p>
@@ -1960,15 +1830,7 @@
             </w:tcMar>
           </w:tcPr>
           <w:p>
-            <w:pPr>
-              <w:spacing w:after="0"/>
-            </w:pPr>
             <w:r>
-              <w:rPr>
-                <w:rFonts w:ascii="Times New Roman" w:hAnsi="Times New Roman"/>
-                <w:b/>
-                <w:sz w:val="20"/>
-              </w:rPr>
               <w:t>Software</w:t>
             </w:r>
           </w:p>
@@ -1985,15 +1847,8 @@
             </w:tcMar>
           </w:tcPr>
           <w:p>
-            <w:pPr>
-              <w:spacing w:after="0"/>
-            </w:pPr>
             <w:r>
-              <w:rPr>
-                <w:rFonts w:ascii="Times New Roman" w:hAnsi="Times New Roman"/>
-                <w:sz w:val="20"/>
-              </w:rPr>
-              <w:t>Python 3, Flask, SQLite, HTML5, CSS3, JavaScript ES6, scikit-learn for optional text similarity, Visual Studio Code, and a modern web browser.</w:t>
+              <w:t>A modern web browser such as Google Chrome or Microsoft Edge, a text editor such as Visual Studio Code, and the FindIt HTML, CSS, and JavaScript files. Node.js is optional and is used only to run the lightweight JavaScript algorithm check.</w:t>
             </w:r>
           </w:p>
         </w:tc>
@@ -2012,15 +1867,7 @@
             </w:tcMar>
           </w:tcPr>
           <w:p>
-            <w:pPr>
-              <w:spacing w:after="0"/>
-            </w:pPr>
             <w:r>
-              <w:rPr>
-                <w:rFonts w:ascii="Times New Roman" w:hAnsi="Times New Roman"/>
-                <w:b/>
-                <w:sz w:val="20"/>
-              </w:rPr>
               <w:t>Hardware</w:t>
             </w:r>
           </w:p>
@@ -2037,15 +1884,8 @@
             </w:tcMar>
           </w:tcPr>
           <w:p>
-            <w:pPr>
-              <w:spacing w:after="0"/>
-            </w:pPr>
             <w:r>
-              <w:rPr>
-                <w:rFonts w:ascii="Times New Roman" w:hAnsi="Times New Roman"/>
-                <w:sz w:val="20"/>
-              </w:rPr>
-              <w:t>A computer with an Intel i3 or equivalent processor, 4 GB RAM, and approximately 500 MB of free storage. Internet access is useful for development resources but is not required for local testing.</w:t>
+              <w:t>A computer with an Intel i3 or equivalent processor, 4 GB RAM, and approximately 500 MB of free storage. No specialised hardware or sensors are required.</w:t>
             </w:r>
           </w:p>
         </w:tc>
@@ -2064,15 +1904,7 @@
             </w:tcMar>
           </w:tcPr>
           <w:p>
-            <w:pPr>
-              <w:spacing w:after="0"/>
-            </w:pPr>
             <w:r>
-              <w:rPr>
-                <w:rFonts w:ascii="Times New Roman" w:hAnsi="Times New Roman"/>
-                <w:b/>
-                <w:sz w:val="20"/>
-              </w:rPr>
               <w:t>Testing</w:t>
             </w:r>
           </w:p>
@@ -2089,15 +1921,8 @@
             </w:tcMar>
           </w:tcPr>
           <w:p>
-            <w:pPr>
-              <w:spacing w:after="0"/>
-            </w:pPr>
             <w:r>
-              <w:rPr>
-                <w:rFonts w:ascii="Times New Roman" w:hAnsi="Times New Roman"/>
-                <w:sz w:val="20"/>
-              </w:rPr>
-              <w:t>Google Chrome or Microsoft Edge; local development and testing environment</w:t>
+              <w:t>Open index.html in a modern browser. For the optional logic check, run node algorithms.test.mjs from the project folder.</w:t>
             </w:r>
           </w:p>
         </w:tc>
@@ -2127,33 +1952,6 @@
         <w:spacing w:after="60"/>
       </w:pPr>
       <w:r>
-        <w:t>C. D. Manning and H. Schutze, Foundations of Statistical Natural Language Processing, MIT Press.</w:t>
-      </w:r>
-    </w:p>
-    <w:p>
-      <w:pPr>
-        <w:pStyle w:val="ListNumber"/>
-        <w:spacing w:after="60"/>
-      </w:pPr>
-      <w:r>
-        <w:t>F. Chollet et al., Flask Documentation, Pallets Projects.</w:t>
-      </w:r>
-    </w:p>
-    <w:p>
-      <w:pPr>
-        <w:pStyle w:val="ListNumber"/>
-        <w:spacing w:after="60"/>
-      </w:pPr>
-      <w:r>
-        <w:t>F. Pedregosa et al., Scikit-learn: Machine Learning in Python, Journal of Machine Learning Research, 2011.</w:t>
-      </w:r>
-    </w:p>
-    <w:p>
-      <w:pPr>
-        <w:pStyle w:val="ListNumber"/>
-        <w:spacing w:after="60"/>
-      </w:pPr>
-      <w:r>
         <w:t>Mozilla Developer Network, HTML, CSS, JavaScript, and Web Storage Documentation, MDN Web Docs.</w:t>
       </w:r>
     </w:p>
@@ -2163,7 +1961,34 @@
         <w:spacing w:after="60"/>
       </w:pPr>
       <w:r>
-        <w:t>SQLite Documentation, SQLite Consortium.</w:t>
+        <w:t>ECMAScript Language Specification, ECMA International, for the JavaScript language concepts used in the application.</w:t>
+      </w:r>
+    </w:p>
+    <w:p>
+      <w:pPr>
+        <w:pStyle w:val="ListNumber"/>
+        <w:spacing w:after="60"/>
+      </w:pPr>
+      <w:r>
+        <w:t>SQLite Documentation was reviewed as background for structured data storage but is not used in the final browser-only implementation.</w:t>
+      </w:r>
+    </w:p>
+    <w:p>
+      <w:pPr>
+        <w:pStyle w:val="ListNumber"/>
+        <w:spacing w:after="60"/>
+      </w:pPr>
+      <w:r>
+        <w:t>FindIt project source code and JavaScript algorithm checks, maintained in the project repository.</w:t>
+      </w:r>
+    </w:p>
+    <w:p>
+      <w:pPr>
+        <w:pStyle w:val="ListNumber"/>
+        <w:spacing w:after="60"/>
+      </w:pPr>
+      <w:r>
+        <w:t>SSTC project synopsis requirements and classroom guidance for the proposed work.</w:t>
       </w:r>
     </w:p>
     <w:sectPr>

</xml_diff>

<commit_message>
feat: integrate C++ SQLite backend, admin password reset, and updated synopsis
</commit_message>
<xml_diff>
--- a/FindIt_Project_Synopsis.docx
+++ b/FindIt_Project_Synopsis.docx
@@ -1216,7 +1216,7 @@
         <w:jc w:val="both"/>
       </w:pPr>
       <w:r>
-        <w:t>FindIt is a responsive web application for students and staff. A user can submit a lost-item or found-item report, search reports using a keyword search and dropdown filters, and view possible matches. The matching module compares category, colour, location, date, and description tokens. A transparent weighted score ranks the results, while a small synonym-normalisation step helps relate words such as earbuds and earphones. Records are stored in the browser using localStorage, so the current version is suitable for a local demonstration and does not require a server.</w:t>
+        <w:t>FindIt is a responsive web application for students and staff. A user can submit a lost-item or found-item report, search reports using a keyword search and dropdown filters, and view possible matches. The matching module compares category, colour, location, date, and description tokens. A transparent weighted score ranks the results, while a small synonym-normalisation step helps relate words such as earbuds and earphones. Records are stored in a SQLite database managed by a C++ REST server, so reports are shared across devices through the campus server.</w:t>
       </w:r>
     </w:p>
     <w:p>
@@ -1305,7 +1305,7 @@
         <w:jc w:val="both"/>
       </w:pPr>
       <w:r>
-        <w:t>The current system supports student or staff reporting, keyword search, dropdown filtering, matching, status updates, and a coordinator review view. It does not provide a shared online database, user authentication, email notifications, payment, public social networking, real-time GPS tracking, image upload, or guaranteed identity verification. Since the current version uses browser localStorage, records remain on the device and are not automatically shared across devices. These features can be considered in a future server-backed or mobile version.</w:t>
+        <w:t>The current system supports student or staff reporting, keyword search, dropdown filtering, matching, status updates, and a coordinator review view. It does not provide a shared online database, user authentication, email notifications, payment, public social networking, real-time GPS tracking, image upload, or guaranteed identity verification. Records now live in a central SQLite database shared through the C++ server, and a 7-day retention policy automatically purges expired listings to protect privacy. Coordinator authentication is already provided by the server; the remaining features can be considered in a future mobile version.</w:t>
       </w:r>
     </w:p>
     <w:p>
@@ -1322,7 +1322,7 @@
         <w:jc w:val="both"/>
       </w:pPr>
       <w:r>
-        <w:t>The final project uses HTML5 for structure, CSS3 for responsive presentation, and vanilla JavaScript for validation, navigation, localStorage data management, searching, filtering, status changes, and matching. The implementation uses arrays, objects, sets, loops, and string-token processing rather than a separate backend or external library. The matching score gives fixed weights to category, colour, location, date, and description similarity, making every suggestion explainable and easy to test.</w:t>
+        <w:t>The final project uses HTML5 for structure, CSS3 for responsive presentation, and vanilla JavaScript for the interface, backed by a C++ REST server (Winsock) with a SQLite database for storage, report submission, coordinator authentication, status updates, and 7-day data retention. The implementation uses arrays, objects, sets, loops, and string-token processing rather than a separate backend or external library. The matching score gives fixed weights to category, colour, location, date, and description similarity, making every suggestion explainable and easy to test.</w:t>
       </w:r>
     </w:p>
     <w:tbl>
@@ -1695,7 +1695,7 @@
         <w:spacing w:after="60"/>
       </w:pPr>
       <w:r>
-        <w:t>Client-side data design: define the report object, sample records, status values, and localStorage format.</w:t>
+        <w:t>Data design: define the report fields, status values, and the SQLite schema served by the C++ REST API.</w:t>
       </w:r>
     </w:p>
     <w:p>
@@ -1704,7 +1704,7 @@
         <w:spacing w:after="60"/>
       </w:pPr>
       <w:r>
-        <w:t>Core implementation: build the report form, required-field validation, localStorage operations, search, filtering, and status management.</w:t>
+        <w:t>Core implementation: build the report form and required-field validation in the browser, and the C++ REST endpoints (submit, list, coordinator login, status update) backed by SQLite.</w:t>
       </w:r>
     </w:p>
     <w:p>
@@ -1731,7 +1731,7 @@
         <w:spacing w:after="60"/>
       </w:pPr>
       <w:r>
-        <w:t>Testing and evaluation: run JavaScript algorithm checks, test incomplete reports, publish a report in the browser, inspect search results, verify match ranking, and test coordinator status changes.</w:t>
+        <w:t>Testing and evaluation: run the automated end-to-end API checks against the C++ server, test incomplete reports in the browser, inspect search results, verify match ranking, and exercise coordinator login and status changes on the live preview.</w:t>
       </w:r>
     </w:p>
     <w:p>

</xml_diff>